<commit_message>
i modified the display of my datas, i added the option list of members, and multiple booking
</commit_message>
<xml_diff>
--- a/Report FLC.docx
+++ b/Report FLC.docx
@@ -12,7 +12,7 @@
         <w:pBdr/>
         <w:spacing w:after="0" w:line="276" w:lineRule="auto"/>
         <w:ind w:right="0" w:firstLine="0" w:left="0"/>
-        <w:jc w:val="left"/>
+        <w:jc w:val="both"/>
         <w:rPr>
           <w:rFonts w:ascii="Liberation Serif" w:hAnsi="Liberation Serif" w:cs="Liberation Serif"/>
           <w:b/>
@@ -50,7 +50,7 @@
         <w:pBdr/>
         <w:spacing w:after="0" w:line="276" w:lineRule="auto"/>
         <w:ind w:right="0" w:firstLine="0" w:left="0"/>
-        <w:jc w:val="left"/>
+        <w:jc w:val="both"/>
         <w:rPr>
           <w:rFonts w:ascii="Liberation Serif" w:hAnsi="Liberation Serif" w:cs="Liberation Serif"/>
           <w:sz w:val="24"/>
@@ -94,10 +94,11 @@
         <w:ind w:right="0" w:firstLine="0" w:left="0"/>
         <w:jc w:val="both"/>
         <w:rPr>
-          <w:rFonts w:ascii="Liberation Serif" w:hAnsi="Liberation Serif" w:cs="Liberation Serif"/>
+          <w:rFonts w:ascii="Liberation Serif" w:hAnsi="Liberation Serif" w:eastAsia="Liberation Serif" w:cs="Liberation Serif"/>
           <w:sz w:val="24"/>
           <w:szCs w:val="24"/>
           <w:highlight w:val="none"/>
+          <w:lang w:val="en-US"/>
         </w:rPr>
       </w:pPr>
       <w:r>
@@ -132,11 +133,10 @@
       </w:r>
       <w:r>
         <w:rPr>
-          <w:rFonts w:ascii="Liberation Serif" w:hAnsi="Liberation Serif" w:eastAsia="Liberation Serif" w:cs="Liberation Serif"/>
+          <w:rFonts w:ascii="Liberation Serif" w:hAnsi="Liberation Serif" w:cs="Liberation Serif"/>
           <w:sz w:val="24"/>
           <w:szCs w:val="24"/>
           <w:highlight w:val="none"/>
-          <w:lang w:val="en-US"/>
         </w:rPr>
       </w:r>
     </w:p>
@@ -145,7 +145,48 @@
         <w:pBdr/>
         <w:spacing w:after="0" w:line="276" w:lineRule="auto"/>
         <w:ind w:right="0" w:firstLine="0" w:left="0"/>
-        <w:jc w:val="left"/>
+        <w:jc w:val="both"/>
+        <w:rPr>
+          <w:rFonts w:ascii="Liberation Serif" w:hAnsi="Liberation Serif" w:cs="Liberation Serif"/>
+          <w:sz w:val="24"/>
+          <w:szCs w:val="24"/>
+          <w:highlight w:val="none"/>
+        </w:rPr>
+      </w:pPr>
+      <w:r>
+        <w:rPr>
+          <w:rFonts w:ascii="Liberation Serif" w:hAnsi="Liberation Serif" w:eastAsia="Liberation Serif" w:cs="Liberation Serif"/>
+          <w:sz w:val="24"/>
+          <w:szCs w:val="24"/>
+          <w:highlight w:val="none"/>
+          <w:lang w:val="en-US"/>
+        </w:rPr>
+      </w:r>
+      <w:r>
+        <w:rPr>
+          <w:rFonts w:ascii="Liberation Serif" w:hAnsi="Liberation Serif" w:eastAsia="Liberation Serif" w:cs="Liberation Serif"/>
+          <w:sz w:val="24"/>
+          <w:szCs w:val="24"/>
+          <w:highlight w:val="none"/>
+          <w:lang w:val="en-US"/>
+        </w:rPr>
+      </w:r>
+      <w:r>
+        <w:rPr>
+          <w:rFonts w:ascii="Liberation Serif" w:hAnsi="Liberation Serif" w:eastAsia="Liberation Serif" w:cs="Liberation Serif"/>
+          <w:sz w:val="24"/>
+          <w:szCs w:val="24"/>
+          <w:highlight w:val="none"/>
+          <w:lang w:val="en-US"/>
+        </w:rPr>
+      </w:r>
+    </w:p>
+    <w:p>
+      <w:pPr>
+        <w:pBdr/>
+        <w:spacing w:after="0" w:line="276" w:lineRule="auto"/>
+        <w:ind w:right="0" w:firstLine="0" w:left="0"/>
+        <w:jc w:val="both"/>
         <w:rPr>
           <w:rFonts w:ascii="Liberation Serif" w:hAnsi="Liberation Serif" w:cs="Liberation Serif"/>
           <w:sz w:val="24"/>
@@ -180,10 +221,11 @@
         <w:ind w:right="0" w:firstLine="0" w:left="0"/>
         <w:jc w:val="both"/>
         <w:rPr>
-          <w:rFonts w:ascii="Liberation Serif" w:hAnsi="Liberation Serif" w:cs="Liberation Serif"/>
+          <w:rFonts w:ascii="Liberation Serif" w:hAnsi="Liberation Serif" w:eastAsia="Liberation Serif" w:cs="Liberation Serif"/>
           <w:sz w:val="24"/>
           <w:szCs w:val="24"/>
           <w:highlight w:val="none"/>
+          <w:lang w:val="en-US" w:bidi="en-US"/>
         </w:rPr>
       </w:pPr>
       <w:r>
@@ -215,13 +257,62 @@
           <w:lang w:val="en-US" w:bidi="en-US"/>
         </w:rPr>
       </w:r>
+      <w:r>
+        <w:rPr>
+          <w:rFonts w:ascii="Liberation Serif" w:hAnsi="Liberation Serif" w:cs="Liberation Serif"/>
+          <w:sz w:val="24"/>
+          <w:szCs w:val="24"/>
+          <w:highlight w:val="none"/>
+        </w:rPr>
+      </w:r>
     </w:p>
     <w:p>
       <w:pPr>
         <w:pBdr/>
         <w:spacing w:after="0" w:line="276" w:lineRule="auto"/>
         <w:ind w:right="0" w:firstLine="0" w:left="0"/>
-        <w:jc w:val="left"/>
+        <w:jc w:val="both"/>
+        <w:rPr>
+          <w:rFonts w:ascii="Liberation Serif" w:hAnsi="Liberation Serif" w:cs="Liberation Serif"/>
+          <w:sz w:val="24"/>
+          <w:szCs w:val="24"/>
+          <w:highlight w:val="none"/>
+        </w:rPr>
+      </w:pPr>
+      <w:r>
+        <w:rPr>
+          <w:rFonts w:ascii="Liberation Serif" w:hAnsi="Liberation Serif" w:eastAsia="Liberation Serif" w:cs="Liberation Serif"/>
+          <w:sz w:val="24"/>
+          <w:szCs w:val="24"/>
+          <w:highlight w:val="none"/>
+          <w:lang w:val="en-US" w:bidi="en-US"/>
+        </w:rPr>
+      </w:r>
+      <w:r>
+        <w:rPr>
+          <w:rFonts w:ascii="Liberation Serif" w:hAnsi="Liberation Serif" w:eastAsia="Liberation Serif" w:cs="Liberation Serif"/>
+          <w:sz w:val="24"/>
+          <w:szCs w:val="24"/>
+          <w:highlight w:val="none"/>
+          <w:lang w:val="en-US" w:bidi="en-US"/>
+        </w:rPr>
+      </w:r>
+      <w:r>
+        <w:rPr>
+          <w:rFonts w:ascii="Liberation Serif" w:hAnsi="Liberation Serif" w:eastAsia="Liberation Serif" w:cs="Liberation Serif"/>
+          <w:sz w:val="24"/>
+          <w:szCs w:val="24"/>
+          <w:highlight w:val="none"/>
+          <w:lang w:val="en-US" w:bidi="en-US"/>
+        </w:rPr>
+      </w:r>
+    </w:p>
+    <w:p>
+      <w:pPr>
+        <w:pBdr/>
+        <w:spacing w:after="0" w:line="276" w:lineRule="auto"/>
+        <w:ind w:right="0" w:firstLine="0" w:left="0"/>
+        <w:jc w:val="both"/>
         <w:rPr>
           <w:rFonts w:ascii="Liberation Serif" w:hAnsi="Liberation Serif" w:cs="Liberation Serif"/>
           <w:sz w:val="24"/>
@@ -464,7 +555,7 @@
         </w:pBdr>
         <w:spacing w:after="0" w:line="276" w:lineRule="auto"/>
         <w:ind w:right="0" w:firstLine="0" w:left="0"/>
-        <w:jc w:val="left"/>
+        <w:jc w:val="both"/>
         <w:rPr>
           <w:rFonts w:ascii="Liberation Serif" w:hAnsi="Liberation Serif" w:cs="Liberation Serif"/>
           <w:b w:val="0"/>
@@ -477,7 +568,7 @@
       </w:pPr>
       <w:r>
         <w:rPr>
-          <w:rFonts w:ascii="Liberation Serif" w:hAnsi="Liberation Serif" w:cs="Liberation Serif"/>
+          <w:rFonts w:ascii="Liberation Serif" w:hAnsi="Liberation Serif" w:eastAsia="Liberation Serif" w:cs="Liberation Serif"/>
           <w:b w:val="0"/>
           <w:bCs w:val="0"/>
           <w:color w:val="000000"/>
@@ -488,7 +579,7 @@
       </w:r>
       <w:r>
         <w:rPr>
-          <w:rFonts w:ascii="Liberation Serif" w:hAnsi="Liberation Serif" w:cs="Liberation Serif"/>
+          <w:rFonts w:ascii="Liberation Serif" w:hAnsi="Liberation Serif" w:eastAsia="Liberation Serif" w:cs="Liberation Serif"/>
           <w:b w:val="0"/>
           <w:bCs w:val="0"/>
           <w:color w:val="000000"/>
@@ -499,7 +590,7 @@
       </w:r>
       <w:r>
         <w:rPr>
-          <w:rFonts w:ascii="Liberation Serif" w:hAnsi="Liberation Serif" w:cs="Liberation Serif"/>
+          <w:rFonts w:ascii="Liberation Serif" w:hAnsi="Liberation Serif" w:eastAsia="Liberation Serif" w:cs="Liberation Serif"/>
           <w:b w:val="0"/>
           <w:bCs w:val="0"/>
           <w:color w:val="000000"/>
@@ -520,7 +611,7 @@
         </w:pBdr>
         <w:spacing w:after="0" w:line="276" w:lineRule="auto"/>
         <w:ind w:right="0" w:firstLine="0" w:left="0"/>
-        <w:jc w:val="left"/>
+        <w:jc w:val="both"/>
         <w:rPr>
           <w:rFonts w:ascii="Liberation Serif" w:hAnsi="Liberation Serif" w:cs="Liberation Serif"/>
           <w:sz w:val="24"/>
@@ -1215,7 +1306,7 @@
         </w:pBdr>
         <w:spacing w:after="0" w:line="276" w:lineRule="auto"/>
         <w:ind w:right="0" w:firstLine="0" w:left="0"/>
-        <w:jc w:val="left"/>
+        <w:jc w:val="both"/>
         <w:rPr>
           <w:rFonts w:ascii="Liberation Serif" w:hAnsi="Liberation Serif" w:cs="Liberation Serif"/>
           <w:b w:val="0"/>
@@ -1376,7 +1467,7 @@
         </w:pBdr>
         <w:spacing w:after="0" w:line="276" w:lineRule="auto"/>
         <w:ind w:right="0" w:firstLine="0" w:left="0"/>
-        <w:jc w:val="left"/>
+        <w:jc w:val="both"/>
         <w:rPr>
           <w:rFonts w:ascii="Liberation Serif" w:hAnsi="Liberation Serif" w:cs="Liberation Serif"/>
           <w:sz w:val="24"/>
@@ -1946,7 +2037,7 @@
         </w:pBdr>
         <w:spacing w:after="0" w:line="276" w:lineRule="auto"/>
         <w:ind w:right="0" w:firstLine="0" w:left="0"/>
-        <w:jc w:val="left"/>
+        <w:jc w:val="both"/>
         <w:rPr>
           <w:rFonts w:ascii="Liberation Serif" w:hAnsi="Liberation Serif" w:cs="Liberation Serif"/>
           <w:b w:val="0"/>
@@ -2253,7 +2344,7 @@
         </w:pBdr>
         <w:spacing w:after="0" w:line="276" w:lineRule="auto"/>
         <w:ind w:right="0" w:firstLine="0" w:left="0"/>
-        <w:jc w:val="left"/>
+        <w:jc w:val="both"/>
         <w:rPr>
           <w:rFonts w:ascii="Liberation Serif" w:hAnsi="Liberation Serif" w:cs="Liberation Serif"/>
           <w:b w:val="0"/>
@@ -2295,6 +2386,420 @@
           <w:sz w:val="24"/>
           <w:szCs w:val="24"/>
           <w:highlight w:val="none"/>
+        </w:rPr>
+      </w:r>
+    </w:p>
+    <w:p>
+      <w:pPr>
+        <w:pBdr>
+          <w:top w:val="none" w:color="000000" w:sz="4" w:space="0"/>
+          <w:left w:val="none" w:color="000000" w:sz="4" w:space="0"/>
+          <w:bottom w:val="none" w:color="000000" w:sz="4" w:space="0"/>
+          <w:right w:val="none" w:color="000000" w:sz="4" w:space="0"/>
+        </w:pBdr>
+        <w:spacing w:after="0" w:line="276" w:lineRule="auto"/>
+        <w:ind w:right="0" w:firstLine="0" w:left="0"/>
+        <w:jc w:val="both"/>
+        <w:rPr>
+          <w:rFonts w:ascii="Liberation Serif" w:hAnsi="Liberation Serif" w:cs="Liberation Serif"/>
+          <w:sz w:val="24"/>
+          <w:szCs w:val="24"/>
+          <w:highlight w:val="none"/>
+        </w:rPr>
+      </w:pPr>
+      <w:r>
+        <w:rPr>
+          <w:rFonts w:ascii="Liberation Serif" w:hAnsi="Liberation Serif" w:eastAsia="Liberation Serif" w:cs="Liberation Serif"/>
+          <w:sz w:val="24"/>
+          <w:szCs w:val="24"/>
+          <w:highlight w:val="none"/>
+          <w:lang w:val="en-US"/>
+        </w:rPr>
+      </w:r>
+      <w:r>
+        <w:rPr>
+          <w:rFonts w:ascii="Liberation Serif" w:hAnsi="Liberation Serif" w:eastAsia="Liberation Serif" w:cs="Liberation Serif"/>
+          <w:sz w:val="24"/>
+          <w:szCs w:val="24"/>
+          <w:highlight w:val="none"/>
+          <w:lang w:val="en-US"/>
+        </w:rPr>
+      </w:r>
+      <w:r>
+        <w:rPr>
+          <w:rFonts w:ascii="Liberation Serif" w:hAnsi="Liberation Serif" w:eastAsia="Liberation Serif" w:cs="Liberation Serif"/>
+          <w:sz w:val="24"/>
+          <w:szCs w:val="24"/>
+          <w:highlight w:val="none"/>
+          <w:lang w:val="en-US"/>
+        </w:rPr>
+      </w:r>
+    </w:p>
+    <w:p>
+      <w:pPr>
+        <w:pBdr>
+          <w:top w:val="none" w:color="000000" w:sz="4" w:space="0"/>
+          <w:left w:val="none" w:color="000000" w:sz="4" w:space="0"/>
+          <w:bottom w:val="none" w:color="000000" w:sz="4" w:space="0"/>
+          <w:right w:val="none" w:color="000000" w:sz="4" w:space="0"/>
+        </w:pBdr>
+        <w:spacing w:after="0" w:line="276" w:lineRule="auto"/>
+        <w:ind w:right="0" w:firstLine="0" w:left="0"/>
+        <w:jc w:val="both"/>
+        <w:rPr>
+          <w:rFonts w:ascii="Liberation Serif" w:hAnsi="Liberation Serif" w:cs="Liberation Serif"/>
+          <w:sz w:val="24"/>
+          <w:szCs w:val="24"/>
+          <w:highlight w:val="none"/>
+        </w:rPr>
+      </w:pPr>
+      <w:r>
+        <w:rPr>
+          <w:rFonts w:ascii="Liberation Serif" w:hAnsi="Liberation Serif" w:eastAsia="Liberation Serif" w:cs="Liberation Serif"/>
+          <w:sz w:val="24"/>
+          <w:szCs w:val="24"/>
+          <w:highlight w:val="none"/>
+          <w:lang w:val="en-US"/>
+        </w:rPr>
+      </w:r>
+      <w:r>
+        <w:rPr>
+          <w:rFonts w:ascii="Liberation Serif" w:hAnsi="Liberation Serif" w:eastAsia="Liberation Serif" w:cs="Liberation Serif"/>
+          <w:sz w:val="24"/>
+          <w:szCs w:val="24"/>
+          <w:highlight w:val="none"/>
+          <w:lang w:val="en-US"/>
+        </w:rPr>
+      </w:r>
+      <w:r>
+        <w:rPr>
+          <w:rFonts w:ascii="Liberation Serif" w:hAnsi="Liberation Serif" w:eastAsia="Liberation Serif" w:cs="Liberation Serif"/>
+          <w:sz w:val="24"/>
+          <w:szCs w:val="24"/>
+          <w:highlight w:val="none"/>
+          <w:lang w:val="en-US"/>
+        </w:rPr>
+      </w:r>
+    </w:p>
+    <w:p>
+      <w:pPr>
+        <w:pBdr>
+          <w:top w:val="none" w:color="000000" w:sz="4" w:space="0"/>
+          <w:left w:val="none" w:color="000000" w:sz="4" w:space="0"/>
+          <w:bottom w:val="none" w:color="000000" w:sz="4" w:space="0"/>
+          <w:right w:val="none" w:color="000000" w:sz="4" w:space="0"/>
+        </w:pBdr>
+        <w:spacing w:after="0" w:line="276" w:lineRule="auto"/>
+        <w:ind w:right="0" w:firstLine="0" w:left="0"/>
+        <w:jc w:val="both"/>
+        <w:rPr>
+          <w:rFonts w:ascii="Liberation Serif" w:hAnsi="Liberation Serif" w:cs="Liberation Serif"/>
+          <w:sz w:val="24"/>
+          <w:szCs w:val="24"/>
+          <w:highlight w:val="none"/>
+        </w:rPr>
+      </w:pPr>
+      <w:r>
+        <w:rPr>
+          <w:rFonts w:ascii="Liberation Serif" w:hAnsi="Liberation Serif" w:eastAsia="Liberation Serif" w:cs="Liberation Serif"/>
+          <w:sz w:val="24"/>
+          <w:szCs w:val="24"/>
+          <w:highlight w:val="none"/>
+          <w:lang w:val="en-US"/>
+        </w:rPr>
+      </w:r>
+      <w:r>
+        <w:rPr>
+          <w:rFonts w:ascii="Liberation Serif" w:hAnsi="Liberation Serif" w:eastAsia="Liberation Serif" w:cs="Liberation Serif"/>
+          <w:sz w:val="24"/>
+          <w:szCs w:val="24"/>
+          <w:highlight w:val="none"/>
+          <w:lang w:val="en-US"/>
+        </w:rPr>
+      </w:r>
+      <w:r>
+        <w:rPr>
+          <w:rFonts w:ascii="Liberation Serif" w:hAnsi="Liberation Serif" w:eastAsia="Liberation Serif" w:cs="Liberation Serif"/>
+          <w:sz w:val="24"/>
+          <w:szCs w:val="24"/>
+          <w:highlight w:val="none"/>
+          <w:lang w:val="en-US"/>
+        </w:rPr>
+      </w:r>
+    </w:p>
+    <w:p>
+      <w:pPr>
+        <w:pBdr>
+          <w:top w:val="none" w:color="000000" w:sz="4" w:space="0"/>
+          <w:left w:val="none" w:color="000000" w:sz="4" w:space="0"/>
+          <w:bottom w:val="none" w:color="000000" w:sz="4" w:space="0"/>
+          <w:right w:val="none" w:color="000000" w:sz="4" w:space="0"/>
+        </w:pBdr>
+        <w:spacing w:after="0" w:line="276" w:lineRule="auto"/>
+        <w:ind w:right="0" w:firstLine="0" w:left="0"/>
+        <w:jc w:val="both"/>
+        <w:rPr>
+          <w:rFonts w:ascii="Liberation Serif" w:hAnsi="Liberation Serif" w:cs="Liberation Serif"/>
+          <w:sz w:val="24"/>
+          <w:szCs w:val="24"/>
+          <w:highlight w:val="none"/>
+        </w:rPr>
+      </w:pPr>
+      <w:r>
+        <w:rPr>
+          <w:rFonts w:ascii="Liberation Serif" w:hAnsi="Liberation Serif" w:eastAsia="Liberation Serif" w:cs="Liberation Serif"/>
+          <w:sz w:val="24"/>
+          <w:szCs w:val="24"/>
+          <w:highlight w:val="none"/>
+          <w:lang w:val="en-US"/>
+        </w:rPr>
+      </w:r>
+      <w:r>
+        <w:rPr>
+          <w:rFonts w:ascii="Liberation Serif" w:hAnsi="Liberation Serif" w:eastAsia="Liberation Serif" w:cs="Liberation Serif"/>
+          <w:sz w:val="24"/>
+          <w:szCs w:val="24"/>
+          <w:highlight w:val="none"/>
+          <w:lang w:val="en-US"/>
+        </w:rPr>
+      </w:r>
+      <w:r>
+        <w:rPr>
+          <w:rFonts w:ascii="Liberation Serif" w:hAnsi="Liberation Serif" w:eastAsia="Liberation Serif" w:cs="Liberation Serif"/>
+          <w:sz w:val="24"/>
+          <w:szCs w:val="24"/>
+          <w:highlight w:val="none"/>
+          <w:lang w:val="en-US"/>
+        </w:rPr>
+      </w:r>
+    </w:p>
+    <w:p>
+      <w:pPr>
+        <w:pBdr>
+          <w:top w:val="none" w:color="000000" w:sz="4" w:space="0"/>
+          <w:left w:val="none" w:color="000000" w:sz="4" w:space="0"/>
+          <w:bottom w:val="none" w:color="000000" w:sz="4" w:space="0"/>
+          <w:right w:val="none" w:color="000000" w:sz="4" w:space="0"/>
+        </w:pBdr>
+        <w:spacing w:after="0" w:line="276" w:lineRule="auto"/>
+        <w:ind w:right="0" w:firstLine="0" w:left="0"/>
+        <w:jc w:val="both"/>
+        <w:rPr>
+          <w:rFonts w:ascii="Liberation Serif" w:hAnsi="Liberation Serif" w:cs="Liberation Serif"/>
+          <w:sz w:val="24"/>
+          <w:szCs w:val="24"/>
+          <w:highlight w:val="none"/>
+        </w:rPr>
+      </w:pPr>
+      <w:r>
+        <w:rPr>
+          <w:rFonts w:ascii="Liberation Serif" w:hAnsi="Liberation Serif" w:eastAsia="Liberation Serif" w:cs="Liberation Serif"/>
+          <w:sz w:val="24"/>
+          <w:szCs w:val="24"/>
+          <w:highlight w:val="none"/>
+          <w:lang w:val="en-US"/>
+        </w:rPr>
+      </w:r>
+      <w:r>
+        <w:rPr>
+          <w:rFonts w:ascii="Liberation Serif" w:hAnsi="Liberation Serif" w:eastAsia="Liberation Serif" w:cs="Liberation Serif"/>
+          <w:sz w:val="24"/>
+          <w:szCs w:val="24"/>
+          <w:highlight w:val="none"/>
+          <w:lang w:val="en-US"/>
+        </w:rPr>
+      </w:r>
+      <w:r>
+        <w:rPr>
+          <w:rFonts w:ascii="Liberation Serif" w:hAnsi="Liberation Serif" w:eastAsia="Liberation Serif" w:cs="Liberation Serif"/>
+          <w:sz w:val="24"/>
+          <w:szCs w:val="24"/>
+          <w:highlight w:val="none"/>
+          <w:lang w:val="en-US"/>
+        </w:rPr>
+      </w:r>
+    </w:p>
+    <w:p>
+      <w:pPr>
+        <w:pBdr>
+          <w:top w:val="none" w:color="000000" w:sz="4" w:space="0"/>
+          <w:left w:val="none" w:color="000000" w:sz="4" w:space="0"/>
+          <w:bottom w:val="none" w:color="000000" w:sz="4" w:space="0"/>
+          <w:right w:val="none" w:color="000000" w:sz="4" w:space="0"/>
+        </w:pBdr>
+        <w:spacing w:after="0" w:line="276" w:lineRule="auto"/>
+        <w:ind w:right="0" w:firstLine="0" w:left="0"/>
+        <w:jc w:val="both"/>
+        <w:rPr>
+          <w:rFonts w:ascii="Liberation Serif" w:hAnsi="Liberation Serif" w:cs="Liberation Serif"/>
+          <w:sz w:val="24"/>
+          <w:szCs w:val="24"/>
+          <w:highlight w:val="none"/>
+        </w:rPr>
+      </w:pPr>
+      <w:r>
+        <w:rPr>
+          <w:rFonts w:ascii="Liberation Serif" w:hAnsi="Liberation Serif" w:eastAsia="Liberation Serif" w:cs="Liberation Serif"/>
+          <w:sz w:val="24"/>
+          <w:szCs w:val="24"/>
+          <w:highlight w:val="none"/>
+          <w:lang w:val="en-US"/>
+        </w:rPr>
+      </w:r>
+      <w:r>
+        <w:rPr>
+          <w:rFonts w:ascii="Liberation Serif" w:hAnsi="Liberation Serif" w:eastAsia="Liberation Serif" w:cs="Liberation Serif"/>
+          <w:sz w:val="24"/>
+          <w:szCs w:val="24"/>
+          <w:highlight w:val="none"/>
+          <w:lang w:val="en-US"/>
+        </w:rPr>
+      </w:r>
+      <w:r>
+        <w:rPr>
+          <w:rFonts w:ascii="Liberation Serif" w:hAnsi="Liberation Serif" w:eastAsia="Liberation Serif" w:cs="Liberation Serif"/>
+          <w:sz w:val="24"/>
+          <w:szCs w:val="24"/>
+          <w:highlight w:val="none"/>
+          <w:lang w:val="en-US"/>
+        </w:rPr>
+      </w:r>
+    </w:p>
+    <w:p>
+      <w:pPr>
+        <w:pBdr>
+          <w:top w:val="none" w:color="000000" w:sz="4" w:space="0"/>
+          <w:left w:val="none" w:color="000000" w:sz="4" w:space="0"/>
+          <w:bottom w:val="none" w:color="000000" w:sz="4" w:space="0"/>
+          <w:right w:val="none" w:color="000000" w:sz="4" w:space="0"/>
+        </w:pBdr>
+        <w:spacing w:after="0" w:line="276" w:lineRule="auto"/>
+        <w:ind w:right="0" w:firstLine="0" w:left="0"/>
+        <w:jc w:val="both"/>
+        <w:rPr>
+          <w:rFonts w:ascii="Liberation Serif" w:hAnsi="Liberation Serif" w:cs="Liberation Serif"/>
+          <w:sz w:val="24"/>
+          <w:szCs w:val="24"/>
+          <w:highlight w:val="none"/>
+        </w:rPr>
+      </w:pPr>
+      <w:r>
+        <w:rPr>
+          <w:rFonts w:ascii="Liberation Serif" w:hAnsi="Liberation Serif" w:eastAsia="Liberation Serif" w:cs="Liberation Serif"/>
+          <w:sz w:val="24"/>
+          <w:szCs w:val="24"/>
+          <w:highlight w:val="none"/>
+          <w:lang w:val="en-US"/>
+        </w:rPr>
+      </w:r>
+      <w:r>
+        <w:rPr>
+          <w:rFonts w:ascii="Liberation Serif" w:hAnsi="Liberation Serif" w:eastAsia="Liberation Serif" w:cs="Liberation Serif"/>
+          <w:sz w:val="24"/>
+          <w:szCs w:val="24"/>
+          <w:highlight w:val="none"/>
+          <w:lang w:val="en-US"/>
+        </w:rPr>
+      </w:r>
+      <w:r>
+        <w:rPr>
+          <w:rFonts w:ascii="Liberation Serif" w:hAnsi="Liberation Serif" w:eastAsia="Liberation Serif" w:cs="Liberation Serif"/>
+          <w:sz w:val="24"/>
+          <w:szCs w:val="24"/>
+          <w:highlight w:val="none"/>
+          <w:lang w:val="en-US"/>
+        </w:rPr>
+      </w:r>
+    </w:p>
+    <w:p>
+      <w:pPr>
+        <w:pBdr>
+          <w:top w:val="none" w:color="000000" w:sz="4" w:space="0"/>
+          <w:left w:val="none" w:color="000000" w:sz="4" w:space="0"/>
+          <w:bottom w:val="none" w:color="000000" w:sz="4" w:space="0"/>
+          <w:right w:val="none" w:color="000000" w:sz="4" w:space="0"/>
+        </w:pBdr>
+        <w:spacing w:after="0" w:line="276" w:lineRule="auto"/>
+        <w:ind w:right="0" w:firstLine="0" w:left="0"/>
+        <w:jc w:val="both"/>
+        <w:rPr>
+          <w:rFonts w:ascii="Liberation Serif" w:hAnsi="Liberation Serif" w:cs="Liberation Serif"/>
+          <w:sz w:val="24"/>
+          <w:szCs w:val="24"/>
+          <w:highlight w:val="none"/>
+        </w:rPr>
+      </w:pPr>
+      <w:r>
+        <w:rPr>
+          <w:rFonts w:ascii="Liberation Serif" w:hAnsi="Liberation Serif" w:eastAsia="Liberation Serif" w:cs="Liberation Serif"/>
+          <w:sz w:val="24"/>
+          <w:szCs w:val="24"/>
+          <w:highlight w:val="none"/>
+          <w:lang w:val="en-US"/>
+        </w:rPr>
+      </w:r>
+      <w:r>
+        <w:rPr>
+          <w:rFonts w:ascii="Liberation Serif" w:hAnsi="Liberation Serif" w:eastAsia="Liberation Serif" w:cs="Liberation Serif"/>
+          <w:sz w:val="24"/>
+          <w:szCs w:val="24"/>
+          <w:highlight w:val="none"/>
+          <w:lang w:val="en-US"/>
+        </w:rPr>
+      </w:r>
+      <w:r>
+        <w:rPr>
+          <w:rFonts w:ascii="Liberation Serif" w:hAnsi="Liberation Serif" w:eastAsia="Liberation Serif" w:cs="Liberation Serif"/>
+          <w:sz w:val="24"/>
+          <w:szCs w:val="24"/>
+          <w:highlight w:val="none"/>
+          <w:lang w:val="en-US"/>
+        </w:rPr>
+      </w:r>
+    </w:p>
+    <w:p>
+      <w:pPr>
+        <w:pBdr>
+          <w:top w:val="none" w:color="000000" w:sz="4" w:space="0"/>
+          <w:left w:val="none" w:color="000000" w:sz="4" w:space="0"/>
+          <w:bottom w:val="none" w:color="000000" w:sz="4" w:space="0"/>
+          <w:right w:val="none" w:color="000000" w:sz="4" w:space="0"/>
+        </w:pBdr>
+        <w:spacing w:after="0" w:line="276" w:lineRule="auto"/>
+        <w:ind w:right="0" w:firstLine="0" w:left="0"/>
+        <w:jc w:val="both"/>
+        <w:rPr>
+          <w:rFonts w:ascii="Liberation Serif" w:hAnsi="Liberation Serif" w:cs="Liberation Serif"/>
+          <w:sz w:val="24"/>
+          <w:szCs w:val="24"/>
+          <w:highlight w:val="none"/>
+        </w:rPr>
+      </w:pPr>
+      <w:r>
+        <w:rPr>
+          <w:rFonts w:ascii="Liberation Serif" w:hAnsi="Liberation Serif" w:eastAsia="Liberation Serif" w:cs="Liberation Serif"/>
+          <w:sz w:val="24"/>
+          <w:szCs w:val="24"/>
+          <w:highlight w:val="none"/>
+          <w:lang w:val="en-US"/>
+        </w:rPr>
+      </w:r>
+      <w:r>
+        <w:rPr>
+          <w:rFonts w:ascii="Liberation Serif" w:hAnsi="Liberation Serif" w:eastAsia="Liberation Serif" w:cs="Liberation Serif"/>
+          <w:sz w:val="24"/>
+          <w:szCs w:val="24"/>
+          <w:highlight w:val="none"/>
+          <w:lang w:val="en-US"/>
+        </w:rPr>
+      </w:r>
+      <w:r>
+        <w:rPr>
+          <w:rFonts w:ascii="Liberation Serif" w:hAnsi="Liberation Serif" w:eastAsia="Liberation Serif" w:cs="Liberation Serif"/>
+          <w:sz w:val="24"/>
+          <w:szCs w:val="24"/>
+          <w:highlight w:val="none"/>
+          <w:lang w:val="en-US"/>
         </w:rPr>
       </w:r>
     </w:p>
@@ -2310,30 +2815,38 @@
         <w:ind w:right="0" w:firstLine="0" w:left="0"/>
         <w:jc w:val="left"/>
         <w:rPr>
+          <w:rFonts w:ascii="Liberation Serif" w:hAnsi="Liberation Serif" w:cs="Liberation Serif"/>
+          <w:sz w:val="24"/>
+          <w:szCs w:val="24"/>
+          <w:highlight w:val="none"/>
+        </w:rPr>
+      </w:pPr>
+      <w:r>
+        <w:rPr>
           <w:rFonts w:ascii="Liberation Serif" w:hAnsi="Liberation Serif" w:eastAsia="Liberation Serif" w:cs="Liberation Serif"/>
           <w:sz w:val="24"/>
           <w:szCs w:val="24"/>
-          <w:highlight w:val="none"/>
+        </w:rPr>
+      </w:r>
+      <w:r>
+        <w:rPr>
+          <w:rFonts w:ascii="Liberation Serif" w:hAnsi="Liberation Serif" w:eastAsia="Liberation Serif" w:cs="Liberation Serif"/>
+          <w:b/>
+          <w:bCs/>
+          <w:sz w:val="24"/>
+          <w:szCs w:val="24"/>
           <w:lang w:val="en-US"/>
         </w:rPr>
-      </w:pPr>
+        <w:t xml:space="preserve">4. UML Class Diagram: </w:t>
+      </w:r>
       <w:r>
         <w:rPr>
           <w:rFonts w:ascii="Liberation Serif" w:hAnsi="Liberation Serif" w:eastAsia="Liberation Serif" w:cs="Liberation Serif"/>
           <w:sz w:val="24"/>
           <w:szCs w:val="24"/>
-          <w:highlight w:val="none"/>
           <w:lang w:val="en-US"/>
         </w:rPr>
-      </w:r>
-      <w:r>
-        <w:rPr>
-          <w:rFonts w:ascii="Liberation Serif" w:hAnsi="Liberation Serif" w:eastAsia="Liberation Serif" w:cs="Liberation Serif"/>
-          <w:sz w:val="24"/>
-          <w:szCs w:val="24"/>
-          <w:highlight w:val="none"/>
-          <w:lang w:val="en-US"/>
-        </w:rPr>
+        <w:br/>
       </w:r>
       <w:r>
         <w:rPr>
@@ -2355,435 +2868,12 @@
         </w:pBdr>
         <w:spacing w:after="0" w:line="276" w:lineRule="auto"/>
         <w:ind w:right="0" w:firstLine="0" w:left="0"/>
-        <w:jc w:val="left"/>
-        <w:rPr>
-          <w:rFonts w:ascii="Liberation Serif" w:hAnsi="Liberation Serif" w:eastAsia="Liberation Serif" w:cs="Liberation Serif"/>
+        <w:jc w:val="both"/>
+        <w:rPr>
+          <w:rFonts w:ascii="Liberation Serif" w:hAnsi="Liberation Serif" w:cs="Liberation Serif"/>
           <w:sz w:val="24"/>
           <w:szCs w:val="24"/>
           <w:highlight w:val="none"/>
-          <w:lang w:val="en-US"/>
-        </w:rPr>
-      </w:pPr>
-      <w:r>
-        <w:rPr>
-          <w:rFonts w:ascii="Liberation Serif" w:hAnsi="Liberation Serif" w:eastAsia="Liberation Serif" w:cs="Liberation Serif"/>
-          <w:sz w:val="24"/>
-          <w:szCs w:val="24"/>
-          <w:highlight w:val="none"/>
-          <w:lang w:val="en-US"/>
-        </w:rPr>
-      </w:r>
-      <w:r>
-        <w:rPr>
-          <w:rFonts w:ascii="Liberation Serif" w:hAnsi="Liberation Serif" w:eastAsia="Liberation Serif" w:cs="Liberation Serif"/>
-          <w:sz w:val="24"/>
-          <w:szCs w:val="24"/>
-          <w:highlight w:val="none"/>
-          <w:lang w:val="en-US"/>
-        </w:rPr>
-      </w:r>
-      <w:r>
-        <w:rPr>
-          <w:rFonts w:ascii="Liberation Serif" w:hAnsi="Liberation Serif" w:eastAsia="Liberation Serif" w:cs="Liberation Serif"/>
-          <w:sz w:val="24"/>
-          <w:szCs w:val="24"/>
-          <w:highlight w:val="none"/>
-          <w:lang w:val="en-US"/>
-        </w:rPr>
-      </w:r>
-    </w:p>
-    <w:p>
-      <w:pPr>
-        <w:pBdr>
-          <w:top w:val="none" w:color="000000" w:sz="4" w:space="0"/>
-          <w:left w:val="none" w:color="000000" w:sz="4" w:space="0"/>
-          <w:bottom w:val="none" w:color="000000" w:sz="4" w:space="0"/>
-          <w:right w:val="none" w:color="000000" w:sz="4" w:space="0"/>
-        </w:pBdr>
-        <w:spacing w:after="0" w:line="276" w:lineRule="auto"/>
-        <w:ind w:right="0" w:firstLine="0" w:left="0"/>
-        <w:jc w:val="left"/>
-        <w:rPr>
-          <w:rFonts w:ascii="Liberation Serif" w:hAnsi="Liberation Serif" w:eastAsia="Liberation Serif" w:cs="Liberation Serif"/>
-          <w:sz w:val="24"/>
-          <w:szCs w:val="24"/>
-          <w:highlight w:val="none"/>
-          <w:lang w:val="en-US"/>
-        </w:rPr>
-      </w:pPr>
-      <w:r>
-        <w:rPr>
-          <w:rFonts w:ascii="Liberation Serif" w:hAnsi="Liberation Serif" w:eastAsia="Liberation Serif" w:cs="Liberation Serif"/>
-          <w:sz w:val="24"/>
-          <w:szCs w:val="24"/>
-          <w:highlight w:val="none"/>
-          <w:lang w:val="en-US"/>
-        </w:rPr>
-      </w:r>
-      <w:r>
-        <w:rPr>
-          <w:rFonts w:ascii="Liberation Serif" w:hAnsi="Liberation Serif" w:eastAsia="Liberation Serif" w:cs="Liberation Serif"/>
-          <w:sz w:val="24"/>
-          <w:szCs w:val="24"/>
-          <w:highlight w:val="none"/>
-          <w:lang w:val="en-US"/>
-        </w:rPr>
-      </w:r>
-      <w:r>
-        <w:rPr>
-          <w:rFonts w:ascii="Liberation Serif" w:hAnsi="Liberation Serif" w:eastAsia="Liberation Serif" w:cs="Liberation Serif"/>
-          <w:sz w:val="24"/>
-          <w:szCs w:val="24"/>
-          <w:highlight w:val="none"/>
-          <w:lang w:val="en-US"/>
-        </w:rPr>
-      </w:r>
-    </w:p>
-    <w:p>
-      <w:pPr>
-        <w:pBdr>
-          <w:top w:val="none" w:color="000000" w:sz="4" w:space="0"/>
-          <w:left w:val="none" w:color="000000" w:sz="4" w:space="0"/>
-          <w:bottom w:val="none" w:color="000000" w:sz="4" w:space="0"/>
-          <w:right w:val="none" w:color="000000" w:sz="4" w:space="0"/>
-        </w:pBdr>
-        <w:spacing w:after="0" w:line="276" w:lineRule="auto"/>
-        <w:ind w:right="0" w:firstLine="0" w:left="0"/>
-        <w:jc w:val="left"/>
-        <w:rPr>
-          <w:rFonts w:ascii="Liberation Serif" w:hAnsi="Liberation Serif" w:eastAsia="Liberation Serif" w:cs="Liberation Serif"/>
-          <w:sz w:val="24"/>
-          <w:szCs w:val="24"/>
-          <w:highlight w:val="none"/>
-          <w:lang w:val="en-US"/>
-        </w:rPr>
-      </w:pPr>
-      <w:r>
-        <w:rPr>
-          <w:rFonts w:ascii="Liberation Serif" w:hAnsi="Liberation Serif" w:eastAsia="Liberation Serif" w:cs="Liberation Serif"/>
-          <w:sz w:val="24"/>
-          <w:szCs w:val="24"/>
-          <w:highlight w:val="none"/>
-          <w:lang w:val="en-US"/>
-        </w:rPr>
-      </w:r>
-      <w:r>
-        <w:rPr>
-          <w:rFonts w:ascii="Liberation Serif" w:hAnsi="Liberation Serif" w:eastAsia="Liberation Serif" w:cs="Liberation Serif"/>
-          <w:sz w:val="24"/>
-          <w:szCs w:val="24"/>
-          <w:highlight w:val="none"/>
-          <w:lang w:val="en-US"/>
-        </w:rPr>
-      </w:r>
-      <w:r>
-        <w:rPr>
-          <w:rFonts w:ascii="Liberation Serif" w:hAnsi="Liberation Serif" w:eastAsia="Liberation Serif" w:cs="Liberation Serif"/>
-          <w:sz w:val="24"/>
-          <w:szCs w:val="24"/>
-          <w:highlight w:val="none"/>
-          <w:lang w:val="en-US"/>
-        </w:rPr>
-      </w:r>
-    </w:p>
-    <w:p>
-      <w:pPr>
-        <w:pBdr>
-          <w:top w:val="none" w:color="000000" w:sz="4" w:space="0"/>
-          <w:left w:val="none" w:color="000000" w:sz="4" w:space="0"/>
-          <w:bottom w:val="none" w:color="000000" w:sz="4" w:space="0"/>
-          <w:right w:val="none" w:color="000000" w:sz="4" w:space="0"/>
-        </w:pBdr>
-        <w:spacing w:after="0" w:line="276" w:lineRule="auto"/>
-        <w:ind w:right="0" w:firstLine="0" w:left="0"/>
-        <w:jc w:val="left"/>
-        <w:rPr>
-          <w:rFonts w:ascii="Liberation Serif" w:hAnsi="Liberation Serif" w:eastAsia="Liberation Serif" w:cs="Liberation Serif"/>
-          <w:sz w:val="24"/>
-          <w:szCs w:val="24"/>
-          <w:highlight w:val="none"/>
-          <w:lang w:val="en-US"/>
-        </w:rPr>
-      </w:pPr>
-      <w:r>
-        <w:rPr>
-          <w:rFonts w:ascii="Liberation Serif" w:hAnsi="Liberation Serif" w:eastAsia="Liberation Serif" w:cs="Liberation Serif"/>
-          <w:sz w:val="24"/>
-          <w:szCs w:val="24"/>
-          <w:highlight w:val="none"/>
-          <w:lang w:val="en-US"/>
-        </w:rPr>
-      </w:r>
-      <w:r>
-        <w:rPr>
-          <w:rFonts w:ascii="Liberation Serif" w:hAnsi="Liberation Serif" w:eastAsia="Liberation Serif" w:cs="Liberation Serif"/>
-          <w:sz w:val="24"/>
-          <w:szCs w:val="24"/>
-          <w:highlight w:val="none"/>
-          <w:lang w:val="en-US"/>
-        </w:rPr>
-      </w:r>
-      <w:r>
-        <w:rPr>
-          <w:rFonts w:ascii="Liberation Serif" w:hAnsi="Liberation Serif" w:eastAsia="Liberation Serif" w:cs="Liberation Serif"/>
-          <w:sz w:val="24"/>
-          <w:szCs w:val="24"/>
-          <w:highlight w:val="none"/>
-          <w:lang w:val="en-US"/>
-        </w:rPr>
-      </w:r>
-    </w:p>
-    <w:p>
-      <w:pPr>
-        <w:pBdr>
-          <w:top w:val="none" w:color="000000" w:sz="4" w:space="0"/>
-          <w:left w:val="none" w:color="000000" w:sz="4" w:space="0"/>
-          <w:bottom w:val="none" w:color="000000" w:sz="4" w:space="0"/>
-          <w:right w:val="none" w:color="000000" w:sz="4" w:space="0"/>
-        </w:pBdr>
-        <w:spacing w:after="0" w:line="276" w:lineRule="auto"/>
-        <w:ind w:right="0" w:firstLine="0" w:left="0"/>
-        <w:jc w:val="left"/>
-        <w:rPr>
-          <w:rFonts w:ascii="Liberation Serif" w:hAnsi="Liberation Serif" w:eastAsia="Liberation Serif" w:cs="Liberation Serif"/>
-          <w:sz w:val="24"/>
-          <w:szCs w:val="24"/>
-          <w:highlight w:val="none"/>
-          <w:lang w:val="en-US"/>
-        </w:rPr>
-      </w:pPr>
-      <w:r>
-        <w:rPr>
-          <w:rFonts w:ascii="Liberation Serif" w:hAnsi="Liberation Serif" w:eastAsia="Liberation Serif" w:cs="Liberation Serif"/>
-          <w:sz w:val="24"/>
-          <w:szCs w:val="24"/>
-          <w:highlight w:val="none"/>
-          <w:lang w:val="en-US"/>
-        </w:rPr>
-      </w:r>
-      <w:r>
-        <w:rPr>
-          <w:rFonts w:ascii="Liberation Serif" w:hAnsi="Liberation Serif" w:eastAsia="Liberation Serif" w:cs="Liberation Serif"/>
-          <w:sz w:val="24"/>
-          <w:szCs w:val="24"/>
-          <w:highlight w:val="none"/>
-          <w:lang w:val="en-US"/>
-        </w:rPr>
-      </w:r>
-      <w:r>
-        <w:rPr>
-          <w:rFonts w:ascii="Liberation Serif" w:hAnsi="Liberation Serif" w:eastAsia="Liberation Serif" w:cs="Liberation Serif"/>
-          <w:sz w:val="24"/>
-          <w:szCs w:val="24"/>
-          <w:highlight w:val="none"/>
-          <w:lang w:val="en-US"/>
-        </w:rPr>
-      </w:r>
-    </w:p>
-    <w:p>
-      <w:pPr>
-        <w:pBdr>
-          <w:top w:val="none" w:color="000000" w:sz="4" w:space="0"/>
-          <w:left w:val="none" w:color="000000" w:sz="4" w:space="0"/>
-          <w:bottom w:val="none" w:color="000000" w:sz="4" w:space="0"/>
-          <w:right w:val="none" w:color="000000" w:sz="4" w:space="0"/>
-        </w:pBdr>
-        <w:spacing w:after="0" w:line="276" w:lineRule="auto"/>
-        <w:ind w:right="0" w:firstLine="0" w:left="0"/>
-        <w:jc w:val="left"/>
-        <w:rPr>
-          <w:rFonts w:ascii="Liberation Serif" w:hAnsi="Liberation Serif" w:eastAsia="Liberation Serif" w:cs="Liberation Serif"/>
-          <w:sz w:val="24"/>
-          <w:szCs w:val="24"/>
-          <w:highlight w:val="none"/>
-          <w:lang w:val="en-US"/>
-        </w:rPr>
-      </w:pPr>
-      <w:r>
-        <w:rPr>
-          <w:rFonts w:ascii="Liberation Serif" w:hAnsi="Liberation Serif" w:eastAsia="Liberation Serif" w:cs="Liberation Serif"/>
-          <w:sz w:val="24"/>
-          <w:szCs w:val="24"/>
-          <w:highlight w:val="none"/>
-          <w:lang w:val="en-US"/>
-        </w:rPr>
-      </w:r>
-      <w:r>
-        <w:rPr>
-          <w:rFonts w:ascii="Liberation Serif" w:hAnsi="Liberation Serif" w:eastAsia="Liberation Serif" w:cs="Liberation Serif"/>
-          <w:sz w:val="24"/>
-          <w:szCs w:val="24"/>
-          <w:highlight w:val="none"/>
-          <w:lang w:val="en-US"/>
-        </w:rPr>
-      </w:r>
-      <w:r>
-        <w:rPr>
-          <w:rFonts w:ascii="Liberation Serif" w:hAnsi="Liberation Serif" w:eastAsia="Liberation Serif" w:cs="Liberation Serif"/>
-          <w:sz w:val="24"/>
-          <w:szCs w:val="24"/>
-          <w:highlight w:val="none"/>
-          <w:lang w:val="en-US"/>
-        </w:rPr>
-      </w:r>
-    </w:p>
-    <w:p>
-      <w:pPr>
-        <w:pBdr>
-          <w:top w:val="none" w:color="000000" w:sz="4" w:space="0"/>
-          <w:left w:val="none" w:color="000000" w:sz="4" w:space="0"/>
-          <w:bottom w:val="none" w:color="000000" w:sz="4" w:space="0"/>
-          <w:right w:val="none" w:color="000000" w:sz="4" w:space="0"/>
-        </w:pBdr>
-        <w:spacing w:after="0" w:line="276" w:lineRule="auto"/>
-        <w:ind w:right="0" w:firstLine="0" w:left="0"/>
-        <w:jc w:val="left"/>
-        <w:rPr>
-          <w:rFonts w:ascii="Liberation Serif" w:hAnsi="Liberation Serif" w:eastAsia="Liberation Serif" w:cs="Liberation Serif"/>
-          <w:sz w:val="24"/>
-          <w:szCs w:val="24"/>
-          <w:highlight w:val="none"/>
-          <w:lang w:val="en-US"/>
-        </w:rPr>
-      </w:pPr>
-      <w:r>
-        <w:rPr>
-          <w:rFonts w:ascii="Liberation Serif" w:hAnsi="Liberation Serif" w:eastAsia="Liberation Serif" w:cs="Liberation Serif"/>
-          <w:sz w:val="24"/>
-          <w:szCs w:val="24"/>
-          <w:highlight w:val="none"/>
-          <w:lang w:val="en-US"/>
-        </w:rPr>
-      </w:r>
-      <w:r>
-        <w:rPr>
-          <w:rFonts w:ascii="Liberation Serif" w:hAnsi="Liberation Serif" w:eastAsia="Liberation Serif" w:cs="Liberation Serif"/>
-          <w:sz w:val="24"/>
-          <w:szCs w:val="24"/>
-          <w:highlight w:val="none"/>
-          <w:lang w:val="en-US"/>
-        </w:rPr>
-      </w:r>
-      <w:r>
-        <w:rPr>
-          <w:rFonts w:ascii="Liberation Serif" w:hAnsi="Liberation Serif" w:eastAsia="Liberation Serif" w:cs="Liberation Serif"/>
-          <w:sz w:val="24"/>
-          <w:szCs w:val="24"/>
-          <w:highlight w:val="none"/>
-          <w:lang w:val="en-US"/>
-        </w:rPr>
-      </w:r>
-    </w:p>
-    <w:p>
-      <w:pPr>
-        <w:pBdr>
-          <w:top w:val="none" w:color="000000" w:sz="4" w:space="0"/>
-          <w:left w:val="none" w:color="000000" w:sz="4" w:space="0"/>
-          <w:bottom w:val="none" w:color="000000" w:sz="4" w:space="0"/>
-          <w:right w:val="none" w:color="000000" w:sz="4" w:space="0"/>
-        </w:pBdr>
-        <w:spacing w:after="0" w:line="276" w:lineRule="auto"/>
-        <w:ind w:right="0" w:firstLine="0" w:left="0"/>
-        <w:jc w:val="left"/>
-        <w:rPr>
-          <w:rFonts w:ascii="Liberation Serif" w:hAnsi="Liberation Serif" w:eastAsia="Liberation Serif" w:cs="Liberation Serif"/>
-          <w:sz w:val="24"/>
-          <w:szCs w:val="24"/>
-          <w:highlight w:val="none"/>
-          <w:lang w:val="en-US"/>
-        </w:rPr>
-      </w:pPr>
-      <w:r>
-        <w:rPr>
-          <w:rFonts w:ascii="Liberation Serif" w:hAnsi="Liberation Serif" w:eastAsia="Liberation Serif" w:cs="Liberation Serif"/>
-          <w:sz w:val="24"/>
-          <w:szCs w:val="24"/>
-          <w:highlight w:val="none"/>
-          <w:lang w:val="en-US"/>
-        </w:rPr>
-      </w:r>
-      <w:r>
-        <w:rPr>
-          <w:rFonts w:ascii="Liberation Serif" w:hAnsi="Liberation Serif" w:eastAsia="Liberation Serif" w:cs="Liberation Serif"/>
-          <w:sz w:val="24"/>
-          <w:szCs w:val="24"/>
-          <w:highlight w:val="none"/>
-          <w:lang w:val="en-US"/>
-        </w:rPr>
-      </w:r>
-      <w:r>
-        <w:rPr>
-          <w:rFonts w:ascii="Liberation Serif" w:hAnsi="Liberation Serif" w:eastAsia="Liberation Serif" w:cs="Liberation Serif"/>
-          <w:sz w:val="24"/>
-          <w:szCs w:val="24"/>
-          <w:highlight w:val="none"/>
-          <w:lang w:val="en-US"/>
-        </w:rPr>
-      </w:r>
-    </w:p>
-    <w:p>
-      <w:pPr>
-        <w:pBdr>
-          <w:top w:val="none" w:color="000000" w:sz="4" w:space="0"/>
-          <w:left w:val="none" w:color="000000" w:sz="4" w:space="0"/>
-          <w:bottom w:val="none" w:color="000000" w:sz="4" w:space="0"/>
-          <w:right w:val="none" w:color="000000" w:sz="4" w:space="0"/>
-        </w:pBdr>
-        <w:spacing w:after="0" w:line="276" w:lineRule="auto"/>
-        <w:ind w:right="0" w:firstLine="0" w:left="0"/>
-        <w:jc w:val="left"/>
-        <w:rPr>
-          <w:rFonts w:ascii="Liberation Serif" w:hAnsi="Liberation Serif" w:eastAsia="Liberation Serif" w:cs="Liberation Serif"/>
-          <w:sz w:val="24"/>
-          <w:szCs w:val="24"/>
-          <w:highlight w:val="none"/>
-          <w:lang w:val="en-US"/>
-        </w:rPr>
-      </w:pPr>
-      <w:r>
-        <w:rPr>
-          <w:rFonts w:ascii="Liberation Serif" w:hAnsi="Liberation Serif" w:eastAsia="Liberation Serif" w:cs="Liberation Serif"/>
-          <w:sz w:val="24"/>
-          <w:szCs w:val="24"/>
-        </w:rPr>
-      </w:r>
-      <w:r>
-        <w:rPr>
-          <w:rFonts w:ascii="Liberation Serif" w:hAnsi="Liberation Serif" w:eastAsia="Liberation Serif" w:cs="Liberation Serif"/>
-          <w:sz w:val="24"/>
-          <w:szCs w:val="24"/>
-          <w:lang w:val="en-US"/>
-        </w:rPr>
-        <w:t xml:space="preserve">4. UML Class Diagram: </w:t>
-        <w:br/>
-      </w:r>
-      <w:r>
-        <w:rPr>
-          <w:rFonts w:ascii="Liberation Serif" w:hAnsi="Liberation Serif" w:eastAsia="Liberation Serif" w:cs="Liberation Serif"/>
-          <w:sz w:val="24"/>
-          <w:szCs w:val="24"/>
-          <w:highlight w:val="none"/>
-          <w:lang w:val="en-US"/>
-        </w:rPr>
-      </w:r>
-    </w:p>
-    <w:p>
-      <w:pPr>
-        <w:pBdr>
-          <w:top w:val="none" w:color="000000" w:sz="4" w:space="0"/>
-          <w:left w:val="none" w:color="000000" w:sz="4" w:space="0"/>
-          <w:bottom w:val="none" w:color="000000" w:sz="4" w:space="0"/>
-          <w:right w:val="none" w:color="000000" w:sz="4" w:space="0"/>
-        </w:pBdr>
-        <w:spacing w:after="0" w:line="276" w:lineRule="auto"/>
-        <w:ind w:right="0" w:firstLine="0" w:left="0"/>
-        <w:jc w:val="left"/>
-        <w:rPr>
-          <w:rFonts w:ascii="Liberation Serif" w:hAnsi="Liberation Serif" w:eastAsia="Liberation Serif" w:cs="Liberation Serif"/>
-          <w:sz w:val="24"/>
-          <w:szCs w:val="24"/>
-          <w:highlight w:val="none"/>
-          <w:lang w:val="en-US" w:bidi="en-US"/>
         </w:rPr>
       </w:pPr>
       <w:r>
@@ -2891,13 +2981,12 @@
         </w:pBdr>
         <w:spacing w:after="0" w:line="276" w:lineRule="auto"/>
         <w:ind w:right="0" w:firstLine="0" w:left="0"/>
-        <w:jc w:val="left"/>
-        <w:rPr>
-          <w:rFonts w:ascii="Liberation Serif" w:hAnsi="Liberation Serif" w:eastAsia="Liberation Serif" w:cs="Liberation Serif"/>
+        <w:jc w:val="both"/>
+        <w:rPr>
+          <w:rFonts w:ascii="Liberation Serif" w:hAnsi="Liberation Serif" w:cs="Liberation Serif"/>
           <w:sz w:val="24"/>
           <w:szCs w:val="24"/>
           <w:highlight w:val="none"/>
-          <w:lang w:val="en-US"/>
         </w:rPr>
       </w:pPr>
       <w:r>
@@ -2938,13 +3027,12 @@
         </w:pBdr>
         <w:spacing w:after="0" w:line="276" w:lineRule="auto"/>
         <w:ind w:right="0" w:firstLine="0" w:left="0"/>
-        <w:jc w:val="left"/>
-        <w:rPr>
-          <w:rFonts w:ascii="Liberation Serif" w:hAnsi="Liberation Serif" w:eastAsia="Liberation Serif" w:cs="Liberation Serif"/>
+        <w:jc w:val="both"/>
+        <w:rPr>
+          <w:rFonts w:ascii="Liberation Serif" w:hAnsi="Liberation Serif" w:cs="Liberation Serif"/>
           <w:sz w:val="24"/>
           <w:szCs w:val="24"/>
           <w:highlight w:val="none"/>
-          <w:lang w:val="en-US"/>
         </w:rPr>
       </w:pPr>
       <w:r>
@@ -2986,6 +3074,7 @@
         </w:pBdr>
         <w:spacing/>
         <w:ind w:right="0" w:firstLine="0" w:left="0"/>
+        <w:jc w:val="both"/>
         <w:rPr>
           <w:rFonts w:ascii="Liberation Serif" w:hAnsi="Liberation Serif" w:cs="Liberation Serif"/>
           <w:sz w:val="24"/>
@@ -3393,7 +3482,7 @@
         </w:pBdr>
         <w:spacing/>
         <w:ind w:right="0"/>
-        <w:jc w:val="both"/>
+        <w:jc w:val="left"/>
         <w:rPr>
           <w:rFonts w:ascii="Liberation Serif" w:hAnsi="Liberation Serif" w:cs="Liberation Serif"/>
           <w:szCs w:val="24"/>
@@ -3408,7 +3497,30 @@
           <w:sz w:val="24"/>
           <w:szCs w:val="24"/>
         </w:rPr>
-        <w:t xml:space="preserve">Core Functionality:</w:t>
+        <w:t xml:space="preserve">Core</w:t>
+      </w:r>
+      <w:r>
+        <w:rPr>
+          <w:rFonts w:ascii="Liberation Serif" w:hAnsi="Liberation Serif" w:eastAsia="Liberation Serif" w:cs="Liberation Serif"/>
+          <w:b w:val="0"/>
+          <w:bCs w:val="0"/>
+          <w:color w:val="000000"/>
+          <w:sz w:val="24"/>
+          <w:szCs w:val="24"/>
+          <w:lang w:val="en-US"/>
+        </w:rPr>
+        <w:t xml:space="preserve"> </w:t>
+      </w:r>
+      <w:r>
+        <w:rPr>
+          <w:rFonts w:ascii="Liberation Serif" w:hAnsi="Liberation Serif" w:eastAsia="Liberation Serif" w:cs="Liberation Serif"/>
+          <w:b w:val="0"/>
+          <w:bCs w:val="0"/>
+          <w:color w:val="000000"/>
+          <w:sz w:val="24"/>
+          <w:szCs w:val="24"/>
+        </w:rPr>
+        <w:t xml:space="preserve">Functionality:</w:t>
       </w:r>
       <w:r>
         <w:rPr>
@@ -3427,7 +3539,7 @@
           <w:sz w:val="24"/>
           <w:szCs w:val="24"/>
         </w:rPr>
-        <w:t xml:space="preserve"> The class enforces a maximum capacity of 4 members. When a new booking is added, the system checks the number of existing bookings. If the lesson is already full, the booking is rejected and the method returns </w:t>
+        <w:t xml:space="preserve">The class enforces a maximum capacity of 4 members. When a new booking is added, the system checks the number of existing bookings. If the lesson is already full, the booking is rejected and the method returns </w:t>
       </w:r>
       <w:r>
         <w:rPr>
@@ -4330,46 +4442,14 @@
       </w:r>
       <w:r>
         <w:rPr>
-          <w:rFonts w:ascii="Liberation Serif" w:hAnsi="Liberation Serif" w:cs="Liberation Serif"/>
-          <w:sz w:val="24"/>
-          <w:szCs w:val="24"/>
-        </w:rPr>
-      </w:r>
-    </w:p>
-    <w:p>
-      <w:pPr>
-        <w:pBdr>
-          <w:top w:val="none" w:color="000000" w:sz="4" w:space="0"/>
-          <w:left w:val="none" w:color="000000" w:sz="4" w:space="0"/>
-          <w:bottom w:val="none" w:color="000000" w:sz="4" w:space="0"/>
-          <w:right w:val="none" w:color="000000" w:sz="4" w:space="0"/>
-        </w:pBdr>
-        <w:spacing/>
-        <w:ind w:right="0"/>
-        <w:jc w:val="both"/>
-        <w:rPr>
-          <w:rFonts w:ascii="Liberation Serif" w:hAnsi="Liberation Serif" w:cs="Liberation Serif"/>
-          <w:sz w:val="24"/>
-          <w:szCs w:val="24"/>
-        </w:rPr>
-      </w:pPr>
-      <w:r>
-        <w:rPr>
-          <w:rFonts w:ascii="Liberation Serif" w:hAnsi="Liberation Serif" w:cs="Liberation Serif"/>
+          <w:rFonts w:ascii="Liberation Serif" w:hAnsi="Liberation Serif" w:eastAsia="Liberation Serif" w:cs="Liberation Serif"/>
           <w:sz w:val="24"/>
           <w:szCs w:val="24"/>
         </w:rPr>
       </w:r>
       <w:r>
         <w:rPr>
-          <w:rFonts w:ascii="Liberation Serif" w:hAnsi="Liberation Serif" w:cs="Liberation Serif"/>
-          <w:sz w:val="24"/>
-          <w:szCs w:val="24"/>
-        </w:rPr>
-      </w:r>
-      <w:r>
-        <w:rPr>
-          <w:rFonts w:ascii="Liberation Serif" w:hAnsi="Liberation Serif" w:cs="Liberation Serif"/>
+          <w:rFonts w:ascii="Liberation Serif" w:hAnsi="Liberation Serif" w:eastAsia="Liberation Serif" w:cs="Liberation Serif"/>
           <w:sz w:val="24"/>
           <w:szCs w:val="24"/>
         </w:rPr>
@@ -5032,7 +5112,7 @@
           <w:right w:val="none" w:color="000000" w:sz="4" w:space="0"/>
         </w:pBdr>
         <w:spacing/>
-        <w:ind w:right="0"/>
+        <w:ind w:right="0" w:firstLine="0" w:left="720"/>
         <w:jc w:val="both"/>
         <w:rPr>
           <w:rFonts w:ascii="Liberation Serif" w:hAnsi="Liberation Serif" w:cs="Liberation Serif"/>
@@ -5043,26 +5123,62 @@
       <w:r>
         <w:rPr>
           <w:rFonts w:ascii="Liberation Serif" w:hAnsi="Liberation Serif" w:eastAsia="Liberation Serif" w:cs="Liberation Serif"/>
+          <w:sz w:val="24"/>
+          <w:szCs w:val="24"/>
+        </w:rPr>
+      </w:r>
+      <w:r>
+        <w:rPr>
+          <w:rFonts w:ascii="Liberation Serif" w:hAnsi="Liberation Serif" w:eastAsia="Liberation Serif" w:cs="Liberation Serif"/>
+          <w:sz w:val="24"/>
+          <w:szCs w:val="24"/>
+        </w:rPr>
+      </w:r>
+      <w:r>
+        <w:rPr>
+          <w:rFonts w:ascii="Liberation Serif" w:hAnsi="Liberation Serif" w:eastAsia="Liberation Serif" w:cs="Liberation Serif"/>
+          <w:sz w:val="24"/>
+          <w:szCs w:val="24"/>
+        </w:rPr>
+      </w:r>
+    </w:p>
+    <w:p>
+      <w:pPr>
+        <w:pBdr>
+          <w:top w:val="none" w:color="000000" w:sz="4" w:space="0"/>
+          <w:left w:val="none" w:color="000000" w:sz="4" w:space="0"/>
+          <w:bottom w:val="none" w:color="000000" w:sz="4" w:space="0"/>
+          <w:right w:val="none" w:color="000000" w:sz="4" w:space="0"/>
+        </w:pBdr>
+        <w:spacing/>
+        <w:ind w:right="0" w:firstLine="0" w:left="0"/>
+        <w:jc w:val="both"/>
+        <w:rPr>
+          <w:rFonts w:ascii="Liberation Serif" w:hAnsi="Liberation Serif" w:cs="Liberation Serif"/>
+          <w:b/>
+          <w:bCs/>
+          <w:sz w:val="24"/>
+          <w:szCs w:val="24"/>
+        </w:rPr>
+      </w:pPr>
+      <w:r>
+        <w:rPr>
+          <w:rFonts w:ascii="Liberation Serif" w:hAnsi="Liberation Serif" w:eastAsia="Liberation Serif" w:cs="Liberation Serif"/>
+          <w:b/>
+          <w:bCs/>
           <w:color w:val="000000"/>
           <w:sz w:val="24"/>
           <w:szCs w:val="24"/>
           <w:highlight w:val="none"/>
-        </w:rPr>
+          <w:lang w:val="en-US"/>
+        </w:rPr>
+        <w:t xml:space="preserve">7. Version Control Log</w:t>
       </w:r>
       <w:r>
         <w:rPr>
           <w:rFonts w:ascii="Liberation Serif" w:hAnsi="Liberation Serif" w:eastAsia="Liberation Serif" w:cs="Liberation Serif"/>
-          <w:color w:val="000000"/>
-          <w:sz w:val="24"/>
-          <w:szCs w:val="24"/>
-          <w:highlight w:val="none"/>
-          <w:lang w:val="en-US"/>
-        </w:rPr>
-        <w:t xml:space="preserve">-</w:t>
-      </w:r>
-      <w:r>
-        <w:rPr>
-          <w:rFonts w:ascii="Liberation Serif" w:hAnsi="Liberation Serif" w:eastAsia="Liberation Serif" w:cs="Liberation Serif"/>
+          <w:b/>
+          <w:bCs/>
           <w:color w:val="000000"/>
           <w:sz w:val="24"/>
           <w:szCs w:val="24"/>
@@ -5080,7 +5196,7 @@
         </w:pBdr>
         <w:spacing w:after="0" w:line="276" w:lineRule="auto"/>
         <w:ind w:right="0" w:firstLine="0" w:left="0"/>
-        <w:jc w:val="left"/>
+        <w:jc w:val="both"/>
         <w:rPr>
           <w:rFonts w:ascii="Liberation Serif" w:hAnsi="Liberation Serif" w:cs="Liberation Serif"/>
           <w:sz w:val="24"/>
@@ -5094,7 +5210,6 @@
           <w:sz w:val="24"/>
           <w:szCs w:val="24"/>
           <w:highlight w:val="none"/>
-          <w:lang w:val="en-US" w:bidi="en-US"/>
         </w:rPr>
       </w:r>
       <w:r>
@@ -5103,8 +5218,74 @@
           <w:sz w:val="24"/>
           <w:szCs w:val="24"/>
           <w:highlight w:val="none"/>
-          <w:lang w:val="en-US" w:bidi="en-US"/>
-        </w:rPr>
+        </w:rPr>
+        <mc:AlternateContent>
+          <mc:Choice Requires="wpg">
+            <w:drawing>
+              <wp:inline xmlns:wp="http://schemas.openxmlformats.org/drawingml/2006/wordprocessingDrawing" distT="0" distB="0" distL="0" distR="0">
+                <wp:extent cx="5940425" cy="3234973"/>
+                <wp:effectExtent l="0" t="0" r="0" b="0"/>
+                <wp:docPr id="2" name=""/>
+                <wp:cNvGraphicFramePr>
+                  <a:graphicFrameLocks xmlns:a="http://schemas.openxmlformats.org/drawingml/2006/main" noChangeAspect="1"/>
+                </wp:cNvGraphicFramePr>
+                <a:graphic xmlns:a="http://schemas.openxmlformats.org/drawingml/2006/main">
+                  <a:graphicData uri="http://schemas.openxmlformats.org/drawingml/2006/picture">
+                    <pic:pic xmlns:pic="http://schemas.openxmlformats.org/drawingml/2006/picture">
+                      <pic:nvPicPr>
+                        <pic:cNvPr id="1606989131" name=""/>
+                        <pic:cNvPicPr>
+                          <a:picLocks noChangeAspect="1"/>
+                        </pic:cNvPicPr>
+                        <pic:nvPr/>
+                      </pic:nvPicPr>
+                      <pic:blipFill rotWithShape="1">
+                        <a:blip r:embed="rId10"/>
+                        <a:stretch/>
+                      </pic:blipFill>
+                      <pic:spPr bwMode="auto">
+                        <a:xfrm>
+                          <a:off x="0" y="0"/>
+                          <a:ext cx="5940424" cy="3234972"/>
+                        </a:xfrm>
+                        <a:prstGeom prst="rect">
+                          <a:avLst/>
+                        </a:prstGeom>
+                      </pic:spPr>
+                    </pic:pic>
+                  </a:graphicData>
+                </a:graphic>
+              </wp:inline>
+            </w:drawing>
+          </mc:Choice>
+          <mc:Fallback>
+            <w:pict>
+              <v:shapetype id="_x0000_t75" coordsize="21600,21600" o:spt="75" o:preferrelative="t" path="m@4@5l@4@11@9@11@9@5xe" filled="f" stroked="f">
+                <v:stroke joinstyle="miter"/>
+                <v:formulas>
+                  <v:f eqn="if lineDrawn pixelLineWidth 0"/>
+                  <v:f eqn="sum @0 1 0"/>
+                  <v:f eqn="sum 0 0 @1"/>
+                  <v:f eqn="prod @2 1 2"/>
+                  <v:f eqn="prod @3 21600 pixelWidth"/>
+                  <v:f eqn="prod @3 21600 pixelHeight"/>
+                  <v:f eqn="sum @0 0 1"/>
+                  <v:f eqn="prod @6 1 2"/>
+                  <v:f eqn="prod @7 21600 pixelWidth"/>
+                  <v:f eqn="sum @8 21600 0"/>
+                  <v:f eqn="prod @7 21600 pixelHeight"/>
+                  <v:f eqn="sum @10 21600 0"/>
+                </v:formulas>
+                <v:path o:extrusionok="f" gradientshapeok="t" o:connecttype="rect"/>
+                <o:lock v:ext="edit" aspectratio="t"/>
+              </v:shapetype>
+              <v:shape id="_x0000_i1" o:spid="_x0000_s1" type="#_x0000_t75" style="width:467.75pt;height:254.72pt;mso-wrap-distance-left:0.00pt;mso-wrap-distance-top:0.00pt;mso-wrap-distance-right:0.00pt;mso-wrap-distance-bottom:0.00pt;z-index:1;" stroked="false">
+                <v:imagedata r:id="rId10" o:title=""/>
+                <o:lock v:ext="edit" rotation="t"/>
+              </v:shape>
+            </w:pict>
+          </mc:Fallback>
+        </mc:AlternateContent>
       </w:r>
       <w:r>
         <w:rPr>
@@ -5112,7 +5293,234 @@
           <w:sz w:val="24"/>
           <w:szCs w:val="24"/>
           <w:highlight w:val="none"/>
+        </w:rPr>
+      </w:r>
+    </w:p>
+    <w:p>
+      <w:pPr>
+        <w:pBdr>
+          <w:top w:val="none" w:color="000000" w:sz="4" w:space="0"/>
+          <w:left w:val="none" w:color="000000" w:sz="4" w:space="0"/>
+          <w:bottom w:val="none" w:color="000000" w:sz="4" w:space="0"/>
+          <w:right w:val="none" w:color="000000" w:sz="4" w:space="0"/>
+        </w:pBdr>
+        <w:spacing w:after="0" w:line="276" w:lineRule="auto"/>
+        <w:ind w:right="0" w:firstLine="0" w:left="0"/>
+        <w:jc w:val="both"/>
+        <w:rPr>
+          <w:rFonts w:ascii="Liberation Serif" w:hAnsi="Liberation Serif" w:cs="Liberation Serif"/>
+          <w:sz w:val="24"/>
+          <w:szCs w:val="24"/>
+          <w:highlight w:val="none"/>
+        </w:rPr>
+      </w:pPr>
+      <w:r>
+        <w:rPr>
+          <w:rFonts w:ascii="Liberation Serif" w:hAnsi="Liberation Serif" w:eastAsia="Liberation Serif" w:cs="Liberation Serif"/>
+          <w:sz w:val="24"/>
+          <w:szCs w:val="24"/>
+          <w:highlight w:val="none"/>
+        </w:rPr>
+      </w:r>
+      <w:r>
+        <w:rPr>
+          <w:rFonts w:ascii="Liberation Serif" w:hAnsi="Liberation Serif" w:eastAsia="Liberation Serif" w:cs="Liberation Serif"/>
+          <w:sz w:val="24"/>
+          <w:szCs w:val="24"/>
+          <w:highlight w:val="none"/>
+        </w:rPr>
+      </w:r>
+      <w:r>
+        <w:rPr>
+          <w:rFonts w:ascii="Liberation Serif" w:hAnsi="Liberation Serif" w:eastAsia="Liberation Serif" w:cs="Liberation Serif"/>
+          <w:sz w:val="24"/>
+          <w:szCs w:val="24"/>
+          <w:highlight w:val="none"/>
+        </w:rPr>
+      </w:r>
+    </w:p>
+    <w:p>
+      <w:pPr>
+        <w:pBdr>
+          <w:top w:val="none" w:color="000000" w:sz="4" w:space="0"/>
+          <w:left w:val="none" w:color="000000" w:sz="4" w:space="0"/>
+          <w:bottom w:val="none" w:color="000000" w:sz="4" w:space="0"/>
+          <w:right w:val="none" w:color="000000" w:sz="4" w:space="0"/>
+        </w:pBdr>
+        <w:spacing w:after="0" w:line="276" w:lineRule="auto"/>
+        <w:ind w:right="0" w:firstLine="0" w:left="0"/>
+        <w:jc w:val="both"/>
+        <w:rPr>
+          <w:rFonts w:ascii="Liberation Serif" w:hAnsi="Liberation Serif" w:cs="Liberation Serif"/>
+          <w:sz w:val="24"/>
+          <w:szCs w:val="24"/>
+          <w:highlight w:val="none"/>
+        </w:rPr>
+      </w:pPr>
+      <w:r>
+        <w:rPr>
+          <w:rFonts w:ascii="Liberation Serif" w:hAnsi="Liberation Serif" w:eastAsia="Liberation Serif" w:cs="Liberation Serif"/>
+          <w:sz w:val="24"/>
+          <w:szCs w:val="24"/>
+          <w:highlight w:val="none"/>
           <w:lang w:val="en-US" w:bidi="en-US"/>
+        </w:rPr>
+      </w:r>
+      <w:r>
+        <w:rPr>
+          <w:rFonts w:ascii="Liberation Serif" w:hAnsi="Liberation Serif" w:eastAsia="Liberation Serif" w:cs="Liberation Serif"/>
+          <w:sz w:val="24"/>
+          <w:szCs w:val="24"/>
+          <w:highlight w:val="none"/>
+          <w:lang w:val="en-US" w:bidi="en-US"/>
+        </w:rPr>
+      </w:r>
+      <w:r>
+        <w:rPr>
+          <w:rFonts w:ascii="Liberation Serif" w:hAnsi="Liberation Serif" w:eastAsia="Liberation Serif" w:cs="Liberation Serif"/>
+          <w:sz w:val="24"/>
+          <w:szCs w:val="24"/>
+          <w:highlight w:val="none"/>
+          <w:lang w:val="en-US" w:bidi="en-US"/>
+        </w:rPr>
+      </w:r>
+    </w:p>
+    <w:p>
+      <w:pPr>
+        <w:pStyle w:val="140"/>
+        <w:pBdr>
+          <w:top w:val="none" w:color="000000" w:sz="4" w:space="0"/>
+          <w:left w:val="none" w:color="000000" w:sz="4" w:space="0"/>
+          <w:bottom w:val="none" w:color="000000" w:sz="4" w:space="0"/>
+          <w:right w:val="none" w:color="000000" w:sz="4" w:space="0"/>
+        </w:pBdr>
+        <w:spacing/>
+        <w:ind w:right="0" w:firstLine="0" w:left="0"/>
+        <w:jc w:val="both"/>
+        <w:rPr>
+          <w:rFonts w:ascii="Liberation Serif" w:hAnsi="Liberation Serif" w:cs="Liberation Serif"/>
+          <w:sz w:val="24"/>
+          <w:szCs w:val="24"/>
+        </w:rPr>
+      </w:pPr>
+      <w:r>
+        <w:rPr>
+          <w:rFonts w:ascii="Liberation Serif" w:hAnsi="Liberation Serif" w:eastAsia="Liberation Serif" w:cs="Liberation Serif"/>
+          <w:b/>
+          <w:color w:val="000000"/>
+          <w:sz w:val="24"/>
+          <w:szCs w:val="24"/>
+        </w:rPr>
+        <w:t xml:space="preserve">8. Summary</w:t>
+      </w:r>
+      <w:r>
+        <w:rPr>
+          <w:rFonts w:ascii="Liberation Serif" w:hAnsi="Liberation Serif" w:eastAsia="Liberation Serif" w:cs="Liberation Serif"/>
+          <w:sz w:val="24"/>
+          <w:szCs w:val="24"/>
+        </w:rPr>
+      </w:r>
+    </w:p>
+    <w:p>
+      <w:pPr>
+        <w:pBdr>
+          <w:top w:val="none" w:color="000000" w:sz="4" w:space="0"/>
+          <w:left w:val="none" w:color="000000" w:sz="4" w:space="0"/>
+          <w:bottom w:val="none" w:color="000000" w:sz="4" w:space="0"/>
+          <w:right w:val="none" w:color="000000" w:sz="4" w:space="0"/>
+        </w:pBdr>
+        <w:spacing/>
+        <w:ind w:right="0" w:firstLine="0" w:left="0"/>
+        <w:jc w:val="both"/>
+        <w:rPr>
+          <w:rFonts w:ascii="Liberation Serif" w:hAnsi="Liberation Serif" w:cs="Liberation Serif"/>
+          <w:szCs w:val="24"/>
+        </w:rPr>
+      </w:pPr>
+      <w:r>
+        <w:rPr>
+          <w:rFonts w:ascii="Liberation Serif" w:hAnsi="Liberation Serif" w:eastAsia="Liberation Serif" w:cs="Liberation Serif"/>
+          <w:color w:val="000000"/>
+          <w:sz w:val="24"/>
+          <w:szCs w:val="24"/>
+        </w:rPr>
+        <w:t xml:space="preserve">The Furzefield Leisure Centre Group Exercise Booking System is a complete and well-structured Object-Oriented solution that meets the initial requirements. It handles important constraints such as booking limits and time conflicts effectively, and provides</w:t>
+      </w:r>
+      <w:r>
+        <w:rPr>
+          <w:rFonts w:ascii="Liberation Serif" w:hAnsi="Liberation Serif" w:eastAsia="Liberation Serif" w:cs="Liberation Serif"/>
+          <w:color w:val="000000"/>
+          <w:sz w:val="24"/>
+          <w:szCs w:val="24"/>
+        </w:rPr>
+        <w:t xml:space="preserve"> useful reports based on system data.</w:t>
+      </w:r>
+      <w:r>
+        <w:rPr>
+          <w:rFonts w:ascii="Liberation Serif" w:hAnsi="Liberation Serif" w:eastAsia="Liberation Serif" w:cs="Liberation Serif"/>
+          <w:sz w:val="24"/>
+          <w:szCs w:val="24"/>
+        </w:rPr>
+      </w:r>
+    </w:p>
+    <w:p>
+      <w:pPr>
+        <w:pBdr>
+          <w:top w:val="none" w:color="000000" w:sz="4" w:space="0"/>
+          <w:left w:val="none" w:color="000000" w:sz="4" w:space="0"/>
+          <w:bottom w:val="none" w:color="000000" w:sz="4" w:space="0"/>
+          <w:right w:val="none" w:color="000000" w:sz="4" w:space="0"/>
+        </w:pBdr>
+        <w:spacing/>
+        <w:ind w:right="0" w:firstLine="0" w:left="0"/>
+        <w:jc w:val="both"/>
+        <w:rPr>
+          <w:rFonts w:ascii="Liberation Serif" w:hAnsi="Liberation Serif" w:cs="Liberation Serif"/>
+          <w:szCs w:val="24"/>
+        </w:rPr>
+      </w:pPr>
+      <w:r>
+        <w:rPr>
+          <w:rFonts w:ascii="Liberation Serif" w:hAnsi="Liberation Serif" w:eastAsia="Liberation Serif" w:cs="Liberation Serif"/>
+          <w:color w:val="000000"/>
+          <w:sz w:val="24"/>
+          <w:szCs w:val="24"/>
+        </w:rPr>
+        <w:t xml:space="preserve">The system is also designed to be extendable, making it easier to add new features in the future. In addition, the use of JUnit testing helps ensure that the system works correctly and reduces the risk of errors when changes are made.</w:t>
+      </w:r>
+      <w:r>
+        <w:rPr>
+          <w:rFonts w:ascii="Liberation Serif" w:hAnsi="Liberation Serif" w:eastAsia="Liberation Serif" w:cs="Liberation Serif"/>
+          <w:sz w:val="24"/>
+          <w:szCs w:val="24"/>
+        </w:rPr>
+      </w:r>
+    </w:p>
+    <w:p>
+      <w:pPr>
+        <w:pBdr/>
+        <w:spacing/>
+        <w:ind/>
+        <w:jc w:val="both"/>
+        <w:rPr>
+          <w:rFonts w:ascii="Liberation Serif" w:hAnsi="Liberation Serif" w:cs="Liberation Serif"/>
+          <w:sz w:val="24"/>
+          <w:szCs w:val="24"/>
+        </w:rPr>
+      </w:pPr>
+      <w:r>
+        <w:rPr>
+          <w:rFonts w:ascii="Liberation Serif" w:hAnsi="Liberation Serif" w:eastAsia="Liberation Serif" w:cs="Liberation Serif"/>
+          <w:sz w:val="24"/>
+          <w:szCs w:val="24"/>
+          <w:lang w:val="en-US"/>
+        </w:rPr>
+      </w:r>
+      <w:r>
+        <w:rPr>
+          <w:rFonts w:ascii="Liberation Serif" w:hAnsi="Liberation Serif" w:eastAsia="Liberation Serif" w:cs="Liberation Serif"/>
+          <w:sz w:val="24"/>
+          <w:szCs w:val="24"/>
         </w:rPr>
       </w:r>
     </w:p>

</xml_diff>